<commit_message>
WGI Perú: prueba definitiva de H3 (Nunn 2007 + FE producto×socio), panel HS6 y libro de resultados
Scripts 19-32: panel HS6 Perú-mundo, gravedad por producto, PPML/IV/panel dinámico/DML-Oster/curva de especificaciones, ECI-PCI, intensidad contractual (Nunn 2007 y Rauch 1999) y prueba definitiva de H3 con efectos fijos producto×socio; módulo común _comun_gravedad.py y README.

Resultados: analisis_avanzados_wgi.xlsx (Resumen + 12 hojas), results_avanzados/ y Anexo técnico (md + docx) con 12 tablas, generado desde las tablas reales.

Propuestas actualizadas (UP ES, general ES, Hinrich EN): H3 de dos lados con el resultado definitivo (se rechaza el efecto positivo); .docx/.pdf regenerados. .gitignore excluye crudos y paneles >20 MB (BACI partner-imports HS6, RTA-Larch y dos paneles derivados).
</commit_message>
<xml_diff>
--- a/investigaciones/rca-shift-share-cptpp-china/propuesta/Hinrich-Proposal-Governance-Trade-Peru-EN.docx
+++ b/investigaciones/rca-shift-share-cptpp-china/propuesta/Hinrich-Proposal-Governance-Trade-Peru-EN.docx
@@ -592,7 +592,7 @@
         <w:t>industrial competitiveness and economic development</w:t>
       </w:r>
       <w:r>
-        <w:t xml:space="preserve"> (Peru's concentration in primary commodities) and to the trade-governance agenda of </w:t>
+        <w:t xml:space="preserve"> (Peru's concentration in primary commodities) and to the trade-governance agenda of the </w:t>
       </w:r>
       <w:r>
         <w:rPr>
@@ -601,7 +601,7 @@
         <w:t>CPTPP</w:t>
       </w:r>
       <w:r>
-        <w:t>, of which Peru is a founding member alongside eight Asia-Pacific economies.</w:t>
+        <w:t>, one of the world's largest trade agreements, of which Peru is a founding signatory alongside ten other economies (the United Kingdom acceded in 2023).</w:t>
       </w:r>
     </w:p>
     <w:p>
@@ -615,7 +615,7 @@
         <w:t>Context.</w:t>
       </w:r>
       <w:r>
-        <w:t xml:space="preserve"> Peru's exports doubled between 2015 and 2024 (US$37.4bn → US$76.8bn), yet the country remains in the lower global quartile on control of corruption and rule of law. Did Peru gain real market share — competitiveness — or did it merely ride world demand and a favourable product mix? And is the "real competitiveness" component associated with the governance of its trading partners? The existing literature produces contradictory results that depend critically on research design: large-sample gravity studies find robust positive effects of institutional quality on trade (De Groot et al. 2004; Abreo Villamizar et al. 2021), while small-panel studies do not (Riker 2022).</w:t>
+        <w:t xml:space="preserve"> Peru's exports doubled between 2015 and 2024 (US$37.4bn → US$76.8bn), yet the country's average governance score moved in the opposite direction — from −0.02 in 2019 to −0.29 in 2024 on the WGI scale, placing Peru around the 27th percentile globally on control of corruption and the 36th on rule of law. Export performance and institutional quality have thus been diverging, not converging. Did Peru gain real market share — competitiveness — or did it merely ride world demand and a favourable product mix? And is the "real competitiveness" component associated with the governance of its trading partners? The existing literature produces contradictory results that depend critically on research design: large-sample gravity studies find robust positive effects of institutional quality on trade (De Groot et al. 2004; Abreo Villamizar et al. 2021), while small-panel studies do not (Riker 2022).</w:t>
       </w:r>
     </w:p>
     <w:p>
@@ -673,7 +673,7 @@
         <w:t>BACI/CEPII</w:t>
       </w:r>
       <w:r>
-        <w:t xml:space="preserve"> (bilateral trade, HS2, 2015–2024), </w:t>
+        <w:t xml:space="preserve"> (bilateral trade, HS2, HS4 and HS6, 2015–2024), </w:t>
       </w:r>
       <w:r>
         <w:rPr>
@@ -682,7 +682,7 @@
         <w:t>World Bank WGI and WDI</w:t>
       </w:r>
       <w:r>
-        <w:t xml:space="preserve"> (governance, GDP), and </w:t>
+        <w:t xml:space="preserve"> (governance, GDP), </w:t>
       </w:r>
       <w:r>
         <w:rPr>
@@ -691,7 +691,43 @@
         <w:t>CEPII GeoDist</w:t>
       </w:r>
       <w:r>
-        <w:t xml:space="preserve"> (distance, contiguity, language, colonial ties). Techniques: Balassa RCA, shift-share decomposition (Tyszynski 1951), and panel OLS gravity models with year effects and country-clustered standard errors (Tinbergen 1962; Santos Silva &amp; Tenreyro 2006), plus an endogeneity battery (lag t−2, first differences, reverse precedence).</w:t>
+        <w:t xml:space="preserve"> (distance, contiguity, language, colonial ties), </w:t>
+      </w:r>
+      <w:r>
+        <w:rPr>
+          <w:b/>
+        </w:rPr>
+        <w:t>CEPII RTA</w:t>
+      </w:r>
+      <w:r>
+        <w:t xml:space="preserve"> (trade agreements), </w:t>
+      </w:r>
+      <w:r>
+        <w:rPr>
+          <w:b/>
+        </w:rPr>
+        <w:t>World Bank country attributes</w:t>
+      </w:r>
+      <w:r>
+        <w:t xml:space="preserve"> (region, income, latitude), and </w:t>
+      </w:r>
+      <w:r>
+        <w:rPr>
+          <w:b/>
+        </w:rPr>
+        <w:t>Nunn's (2007) contract-intensity measure with the Rauch (1999) classification</w:t>
+      </w:r>
+      <w:r>
+        <w:t xml:space="preserve"> mapped to HS6/HS4. Techniques: Balassa RCA, shift-share decomposition (Tyszynski 1951), gravity models (PPML and OLS) with year effects and country-clustered standard errors (Tinbergen 1962; Santos Silva &amp; Tenreyro 2006), product-level gravity with differential exposure and </w:t>
+      </w:r>
+      <w:r>
+        <w:rPr>
+          <w:b/>
+        </w:rPr>
+        <w:t>product × partner fixed effects</w:t>
+      </w:r>
+      <w:r>
+        <w:t>, instrumental variables, double machine learning, Oster's (2019) omitted-variable test, and economic-complexity indices (ECI/PCI).</w:t>
       </w:r>
     </w:p>
     <w:p>
@@ -751,7 +787,16 @@
         <w:t>positive and strongly significant (β = 0.667, p &lt; 0.001)</w:t>
       </w:r>
       <w:r>
-        <w:t>; all standard gravity controls behave as theory predicts. A one-standard-deviation governance advantage (~0.7 WGI points) is associated with ~60% higher bilateral exports (correct log-level transformation).</w:t>
+        <w:t xml:space="preserve">; all standard gravity controls behave as theory predicts. A one-standard-deviation governance advantage (0.88 WGI points, the SD in the estimation panel) is associated with </w:t>
+      </w:r>
+      <w:r>
+        <w:rPr>
+          <w:b/>
+        </w:rPr>
+        <w:t>~80% higher bilateral exports</w:t>
+      </w:r>
+      <w:r>
+        <w:t xml:space="preserve"> (correct log-level transformation).</w:t>
       </w:r>
     </w:p>
     <w:p>
@@ -816,6 +861,102 @@
     </w:p>
     <w:p>
       <w:pPr>
+        <w:pStyle w:val="ListBullet"/>
+      </w:pPr>
+      <w:r>
+        <w:rPr>
+          <w:b/>
+        </w:rPr>
+        <w:t>Extended robustness battery (already computed).</w:t>
+      </w:r>
+      <w:r>
+        <w:t xml:space="preserve"> In levels the association is very stable: it survives a trade-agreement control; instrumental variables — the partner's latitude and its regional (leave-one-out) governance — give a strong first stage (F = 39–67) and a 2SLS coefficient of 0.70–0.96 (p &lt; 0.01), with over-identification caveats (Sargan p = 0.02–0.08); double machine learning gives θ = 0.705 (p &lt; 0.001); all 32 specifications in a specification curve are positive and significant; and Oster's (2019) test yields δ = 2.58 &gt; 1. By contrast, the coefficient </w:t>
+      </w:r>
+      <w:r>
+        <w:rPr>
+          <w:b/>
+        </w:rPr>
+        <w:t>does not survive</w:t>
+      </w:r>
+      <w:r>
+        <w:t xml:space="preserve"> PPML (0.16–0.38, not significant; Gamma PML retains it at 0.696), within-country dynamic-panel estimation, or a </w:t>
+      </w:r>
+      <w:r>
+        <w:rPr>
+          <w:b/>
+        </w:rPr>
+        <w:t>product-level gravity panel</w:t>
+      </w:r>
+      <w:r>
+        <w:t xml:space="preserve"> (HS4, 198,000 observations) where the governance × complexity interaction is negative. A </w:t>
+      </w:r>
+      <w:r>
+        <w:rPr>
+          <w:b/>
+        </w:rPr>
+        <w:t>definitive test of the central hypothesis</w:t>
+      </w:r>
+      <w:r>
+        <w:t xml:space="preserve"> — Nunn's (2007) contract intensity with </w:t>
+      </w:r>
+      <w:r>
+        <w:rPr>
+          <w:b/>
+        </w:rPr>
+        <w:t>product × partner fixed effects</w:t>
+      </w:r>
+      <w:r>
+        <w:t xml:space="preserve"> (HS6 and HS4 panels, 415,000 Peru–partner–product observations) — confirms the pattern: the differential-exposure term (governance × contract intensity) is </w:t>
+      </w:r>
+      <w:r>
+        <w:rPr>
+          <w:b/>
+        </w:rPr>
+        <w:t>not positive in any specification</w:t>
+      </w:r>
+      <w:r>
+        <w:t xml:space="preserve"> and is negative and weakly significant in the highest contract-intensity tercile, so the positive form of the hypothesis is rejected. The evidence is that the signal lives </w:t>
+      </w:r>
+      <w:r>
+        <w:rPr>
+          <w:i/>
+        </w:rPr>
+        <w:t>between</w:t>
+      </w:r>
+      <w:r>
+        <w:t xml:space="preserve"> countries, not within them.</w:t>
+      </w:r>
+    </w:p>
+    <w:p>
+      <w:pPr>
+        <w:pStyle w:val="ListBullet"/>
+      </w:pPr>
+      <w:r>
+        <w:rPr>
+          <w:b/>
+        </w:rPr>
+        <w:t>No detectable CPTPP effect.</w:t>
+      </w:r>
+      <w:r>
+        <w:t xml:space="preserve"> An event study around CPTPP entry into force for Peru (September 2021) finds no aggregate effect and no pre-trend (coefficient ≈ 0, p = 0.90).</w:t>
+      </w:r>
+    </w:p>
+    <w:p>
+      <w:pPr>
+        <w:pStyle w:val="ListBullet"/>
+      </w:pPr>
+      <w:r>
+        <w:rPr>
+          <w:b/>
+        </w:rPr>
+        <w:t>Economic complexity.</w:t>
+      </w:r>
+      <w:r>
+        <w:t xml:space="preserve"> Peru's Economic Complexity Index stands at −0.72 (2024), in the lower part of the distribution, and its diversification opportunities lie adjacent to its current natural-resource basket.</w:t>
+      </w:r>
+    </w:p>
+    <w:p>
+      <w:pPr>
         <w:jc w:val="both"/>
       </w:pPr>
       <w:r>
@@ -825,7 +966,16 @@
         <w:t>Policy relevance.</w:t>
       </w:r>
       <w:r>
-        <w:t xml:space="preserve"> Findings speak directly to: (i) whether trade-agreement governance chapters and trade-facilitation programs should prioritise regulatory quality and government effectiveness; (ii) how export-promotion agencies (PromPerú-type) should weight institutional diagnosis in partner-market selection; and (iii) the ongoing trade-governance debate in CPTPP accession, where institutional capacity is part of the accession conversation for new members.</w:t>
+        <w:t xml:space="preserve"> Findings speak directly to: (i) whether trade-facilitation programs should prioritise regulatory quality and government effectiveness; (ii) how export-promotion agencies (PromPerú-type) should weight institutional diagnosis in partner-market selection; and (iii) the trade-governance debate in CPTPP accession — with the caveat that the study finds </w:t>
+      </w:r>
+      <w:r>
+        <w:rPr>
+          <w:b/>
+        </w:rPr>
+        <w:t>association, not causation</w:t>
+      </w:r>
+      <w:r>
+        <w:t>, and detects no aggregate export effect for Peru from CPTPP entry, so governance chapters are best framed as complements to, not substitutes for, domestic institutional reform.</w:t>
       </w:r>
     </w:p>
     <w:p>
@@ -1050,7 +1200,7 @@
               <w:rPr>
                 <w:sz w:val="18"/>
               </w:rPr>
-              <w:t>Final robustness checks (instrumental-variables exploration now feasible with N = 184; additional subsample splits), literature updates, outline</w:t>
+              <w:t>Remaining robustness checks (contract-intensity concordance; additional subsample splits), literature updates, outline</w:t>
             </w:r>
           </w:p>
         </w:tc>

</xml_diff>